<commit_message>
Ultima actualizacion EGA primer fecha
</commit_message>
<xml_diff>
--- a/1_ega/1_informes/EGA_512_G4_cuestionario.docx
+++ b/1_ega/1_informes/EGA_512_G4_cuestionario.docx
@@ -1440,14 +1440,8 @@
           <w:szCs w:val="18"/>
         </w:rPr>
       </w:pPr>
-      <w:r>
-        <w:rPr>
-          <w:rFonts w:ascii="Arial" w:hAnsi="Arial" w:cs="Arial"/>
-          <w:sz w:val="18"/>
-          <w:szCs w:val="18"/>
-        </w:rPr>
-        <w:tab/>
-      </w:r>
+      <w:bookmarkStart w:id="0" w:name="_GoBack"/>
+      <w:bookmarkEnd w:id="0"/>
       <w:r>
         <w:rPr>
           <w:rFonts w:ascii="Arial" w:hAnsi="Arial" w:cs="Arial"/>
@@ -1518,8 +1512,6 @@
         </w:rPr>
         <w:t>Simula trabajar en “multitarea”.</w:t>
       </w:r>
-      <w:bookmarkStart w:id="0" w:name="_GoBack"/>
-      <w:bookmarkEnd w:id="0"/>
     </w:p>
     <w:p>
       <w:pPr>
@@ -18261,7 +18253,7 @@
       <w:lvlText w:val=""/>
       <w:lvlJc w:val="left"/>
       <w:pPr>
-        <w:ind w:left="1080" w:hanging="360"/>
+        <w:ind w:left="720" w:hanging="360"/>
       </w:pPr>
       <w:rPr>
         <w:rFonts w:ascii="Symbol" w:hAnsi="Symbol" w:hint="default"/>
@@ -18273,7 +18265,7 @@
       <w:lvlText w:val="o"/>
       <w:lvlJc w:val="left"/>
       <w:pPr>
-        <w:ind w:left="1800" w:hanging="360"/>
+        <w:ind w:left="1440" w:hanging="360"/>
       </w:pPr>
       <w:rPr>
         <w:rFonts w:ascii="Courier New" w:hAnsi="Courier New" w:cs="Courier New" w:hint="default"/>
@@ -18285,7 +18277,7 @@
       <w:lvlText w:val=""/>
       <w:lvlJc w:val="left"/>
       <w:pPr>
-        <w:ind w:left="2520" w:hanging="360"/>
+        <w:ind w:left="2160" w:hanging="360"/>
       </w:pPr>
       <w:rPr>
         <w:rFonts w:ascii="Wingdings" w:hAnsi="Wingdings" w:hint="default"/>
@@ -18297,7 +18289,7 @@
       <w:lvlText w:val=""/>
       <w:lvlJc w:val="left"/>
       <w:pPr>
-        <w:ind w:left="3240" w:hanging="360"/>
+        <w:ind w:left="2880" w:hanging="360"/>
       </w:pPr>
       <w:rPr>
         <w:rFonts w:ascii="Symbol" w:hAnsi="Symbol" w:hint="default"/>
@@ -18309,7 +18301,7 @@
       <w:lvlText w:val="o"/>
       <w:lvlJc w:val="left"/>
       <w:pPr>
-        <w:ind w:left="3960" w:hanging="360"/>
+        <w:ind w:left="3600" w:hanging="360"/>
       </w:pPr>
       <w:rPr>
         <w:rFonts w:ascii="Courier New" w:hAnsi="Courier New" w:cs="Courier New" w:hint="default"/>
@@ -18321,7 +18313,7 @@
       <w:lvlText w:val=""/>
       <w:lvlJc w:val="left"/>
       <w:pPr>
-        <w:ind w:left="4680" w:hanging="360"/>
+        <w:ind w:left="4320" w:hanging="360"/>
       </w:pPr>
       <w:rPr>
         <w:rFonts w:ascii="Wingdings" w:hAnsi="Wingdings" w:hint="default"/>
@@ -18333,7 +18325,7 @@
       <w:lvlText w:val=""/>
       <w:lvlJc w:val="left"/>
       <w:pPr>
-        <w:ind w:left="5400" w:hanging="360"/>
+        <w:ind w:left="5040" w:hanging="360"/>
       </w:pPr>
       <w:rPr>
         <w:rFonts w:ascii="Symbol" w:hAnsi="Symbol" w:hint="default"/>
@@ -18345,7 +18337,7 @@
       <w:lvlText w:val="o"/>
       <w:lvlJc w:val="left"/>
       <w:pPr>
-        <w:ind w:left="6120" w:hanging="360"/>
+        <w:ind w:left="5760" w:hanging="360"/>
       </w:pPr>
       <w:rPr>
         <w:rFonts w:ascii="Courier New" w:hAnsi="Courier New" w:cs="Courier New" w:hint="default"/>
@@ -18357,7 +18349,7 @@
       <w:lvlText w:val=""/>
       <w:lvlJc w:val="left"/>
       <w:pPr>
-        <w:ind w:left="6840" w:hanging="360"/>
+        <w:ind w:left="6480" w:hanging="360"/>
       </w:pPr>
       <w:rPr>
         <w:rFonts w:ascii="Wingdings" w:hAnsi="Wingdings" w:hint="default"/>

</xml_diff>